<commit_message>
docs: update milestone 1 report content
</commit_message>
<xml_diff>
--- a/reports/meeting_records/milestone-1-report.docx
+++ b/reports/meeting_records/milestone-1-report.docx
@@ -31,7 +31,19 @@
       </w:r>
       <w:r>
         <w:br/>
-        <w:t>Ngày họp: Thứ Tư, 15/04/2026</w:t>
+        <w:t xml:space="preserve">Ngày họp: Thứ </w:t>
+      </w:r>
+      <w:r>
+        <w:t>Sáu</w:t>
+      </w:r>
+      <w:r>
+        <w:t>, 1</w:t>
+      </w:r>
+      <w:r>
+        <w:t>7</w:t>
+      </w:r>
+      <w:r>
+        <w:t>/04/2026</w:t>
       </w:r>
       <w:r>
         <w:br/>

</xml_diff>

<commit_message>
docs(report): update Milestone 1 progress report
- Document completion of environment setup and base model testing.
- Summarize team realignment decisions in formal reporting format.
- Prepare documentation for academic submission requirements.
</commit_message>
<xml_diff>
--- a/reports/meeting_records/milestone-1-report.docx
+++ b/reports/meeting_records/milestone-1-report.docx
@@ -177,7 +177,13 @@
       </w:r>
       <w:r>
         <w:br/>
-        <w:t>• Ý: Chuyển sang vai trò Technical Supporter, hỗ trợ kỹ thuật tổng quát và phối hợp chéo giữa các mảng.</w:t>
+        <w:t>• Ý: Chuyển sang vai trò Supporter, hỗ trợ</w:t>
+      </w:r>
+      <w:r>
+        <w:t xml:space="preserve"> </w:t>
+      </w:r>
+      <w:r>
+        <w:t>tổng quát và phối hợp chéo giữa các mảng.</w:t>
       </w:r>
     </w:p>
     <w:p>

</xml_diff>